<commit_message>
fix(attestations): page break at the end of the (خ-3) page block
The empty pageBreakBefore paragraph at the start of the block added a blank
line to every page after the first. The build script now puts a page-break
paragraph just before ${/page}; Kh3TemplateProcessor::stripLastPageBreak()
removes the one after the last page. Template rebuilt from the official
blank form (only the break moved).

Co-Authored-By: Claude Fable 5.1 <noreply@anthropic.com>
</commit_message>
<xml_diff>
--- a/resources/forms/kh3-template.docx
+++ b/resources/forms/kh3-template.docx
@@ -6,11 +6,6 @@
       <w:r>
         <w:t>${page}</w:t>
       </w:r>
-    </w:p>
-    <w:p>
-      <w:pPr>
-        <w:pageBreakBefore/>
-      </w:pPr>
     </w:p>
     <w:tbl>
       <w:tblPr>
@@ -2107,6 +2102,11 @@
           <w:lang w:bidi="ar-KW"/>
         </w:rPr>
         <w:t>لاحقا خلال الفصل الدراسي أو أي تغيير في العطل الرسمية.</w:t>
+      </w:r>
+    </w:p>
+    <w:p>
+      <w:r>
+        <w:br w:type="page"/>
       </w:r>
     </w:p>
     <w:p>

</xml_diff>

<commit_message>
fix(attestations): one-page table fit, unbroken footer captions, course lines without parentheses
- Course lines read "{name} {code}" so they no longer wrap around parentheses.
- Schedule table: fixed grid 600/750/2600/720/850x4/2026 (10096, symmetric 368 overhang),
  9 pt week and totals rows, 20-twip top/bottom cell margins, week row height freed.
- Footer captions become one run per paragraph; the tab that split "المنتدب" moves after the word.
- Test writes storage/app/private/generated/sample-kh3.docx for the server-side PDF check.

Co-Authored-By: Claude Fable 5.1 <noreply@anthropic.com>
</commit_message>
<xml_diff>
--- a/resources/forms/kh3-template.docx
+++ b/resources/forms/kh3-template.docx
@@ -916,26 +916,32 @@
       <w:tblPr>
         <w:tblStyle w:val="TableGrid"/>
         <w:bidiVisual/>
-        <w:tblW w:w="9360" w:type="dxa"/>
+        <w:tblW w:w="10096" w:type="dxa"/>
         <w:tblInd w:w="-368" w:type="dxa"/>
         <w:tblLayout w:type="fixed"/>
+        <w:tblCellMar>
+          <w:top w:w="20" w:type="dxa"/>
+          <w:left w:w="108" w:type="dxa"/>
+          <w:bottom w:w="20" w:type="dxa"/>
+          <w:right w:w="108" w:type="dxa"/>
+        </w:tblCellMar>
         <w:tblLook w:val="04A0" w:firstRow="1" w:lastRow="0" w:firstColumn="1" w:lastColumn="0" w:noHBand="0" w:noVBand="1"/>
       </w:tblPr>
       <w:tblGrid>
-        <w:gridCol w:w="668"/>
-        <w:gridCol w:w="990"/>
-        <w:gridCol w:w="1710"/>
+        <w:gridCol w:w="600"/>
+        <w:gridCol w:w="750"/>
+        <w:gridCol w:w="2600"/>
         <w:gridCol w:w="720"/>
-        <w:gridCol w:w="720"/>
-        <w:gridCol w:w="630"/>
-        <w:gridCol w:w="810"/>
-        <w:gridCol w:w="810"/>
-        <w:gridCol w:w="2302"/>
+        <w:gridCol w:w="850"/>
+        <w:gridCol w:w="850"/>
+        <w:gridCol w:w="850"/>
+        <w:gridCol w:w="850"/>
+        <w:gridCol w:w="2026"/>
       </w:tblGrid>
       <w:tr>
         <w:tc>
           <w:tcPr>
-            <w:tcW w:w="668" w:type="dxa"/>
+            <w:tcW w:w="600" w:type="dxa"/>
             <w:vMerge w:val="restart"/>
             <w:tcBorders>
               <w:top w:val="single" w:sz="4" w:space="0" w:color="auto"/>
@@ -975,7 +981,7 @@
         </w:tc>
         <w:tc>
           <w:tcPr>
-            <w:tcW w:w="990" w:type="dxa"/>
+            <w:tcW w:w="750" w:type="dxa"/>
             <w:vMerge w:val="restart"/>
             <w:tcBorders>
               <w:top w:val="single" w:sz="4" w:space="0" w:color="auto"/>
@@ -1013,7 +1019,7 @@
         </w:tc>
         <w:tc>
           <w:tcPr>
-            <w:tcW w:w="1710" w:type="dxa"/>
+            <w:tcW w:w="2600" w:type="dxa"/>
             <w:vMerge w:val="restart"/>
             <w:tcBorders>
               <w:top w:val="single" w:sz="4" w:space="0" w:color="auto"/>
@@ -1091,7 +1097,7 @@
         </w:tc>
         <w:tc>
           <w:tcPr>
-            <w:tcW w:w="2160" w:type="dxa"/>
+            <w:tcW w:w="2550" w:type="dxa"/>
             <w:gridSpan w:val="3"/>
             <w:tcBorders>
               <w:top w:val="single" w:sz="4" w:space="0" w:color="auto"/>
@@ -1130,7 +1136,7 @@
         </w:tc>
         <w:tc>
           <w:tcPr>
-            <w:tcW w:w="810" w:type="dxa"/>
+            <w:tcW w:w="850" w:type="dxa"/>
             <w:vMerge w:val="restart"/>
             <w:tcBorders>
               <w:top w:val="single" w:sz="4" w:space="0" w:color="auto"/>
@@ -1169,7 +1175,7 @@
         </w:tc>
         <w:tc>
           <w:tcPr>
-            <w:tcW w:w="2302" w:type="dxa"/>
+            <w:tcW w:w="2026" w:type="dxa"/>
             <w:vMerge w:val="restart"/>
             <w:tcBorders>
               <w:top w:val="single" w:sz="4" w:space="0" w:color="auto"/>
@@ -1213,7 +1219,7 @@
         </w:trPr>
         <w:tc>
           <w:tcPr>
-            <w:tcW w:w="668" w:type="dxa"/>
+            <w:tcW w:w="600" w:type="dxa"/>
             <w:vMerge/>
             <w:tcBorders>
               <w:top w:val="single" w:sz="4" w:space="0" w:color="auto"/>
@@ -1240,7 +1246,7 @@
         </w:tc>
         <w:tc>
           <w:tcPr>
-            <w:tcW w:w="990" w:type="dxa"/>
+            <w:tcW w:w="750" w:type="dxa"/>
             <w:vMerge/>
             <w:tcBorders>
               <w:top w:val="single" w:sz="4" w:space="0" w:color="auto"/>
@@ -1266,7 +1272,7 @@
         </w:tc>
         <w:tc>
           <w:tcPr>
-            <w:tcW w:w="1710" w:type="dxa"/>
+            <w:tcW w:w="2600" w:type="dxa"/>
             <w:vMerge/>
             <w:tcBorders>
               <w:top w:val="single" w:sz="4" w:space="0" w:color="auto"/>
@@ -1318,7 +1324,7 @@
         </w:tc>
         <w:tc>
           <w:tcPr>
-            <w:tcW w:w="720" w:type="dxa"/>
+            <w:tcW w:w="850" w:type="dxa"/>
             <w:tcBorders>
               <w:top w:val="single" w:sz="4" w:space="0" w:color="auto"/>
               <w:left w:val="single" w:sz="4" w:space="0" w:color="auto"/>
@@ -1356,7 +1362,7 @@
         </w:tc>
         <w:tc>
           <w:tcPr>
-            <w:tcW w:w="630" w:type="dxa"/>
+            <w:tcW w:w="850" w:type="dxa"/>
             <w:tcBorders>
               <w:top w:val="single" w:sz="4" w:space="0" w:color="auto"/>
               <w:left w:val="single" w:sz="4" w:space="0" w:color="auto"/>
@@ -1394,7 +1400,7 @@
         </w:tc>
         <w:tc>
           <w:tcPr>
-            <w:tcW w:w="810" w:type="dxa"/>
+            <w:tcW w:w="850" w:type="dxa"/>
             <w:tcBorders>
               <w:top w:val="single" w:sz="4" w:space="0" w:color="auto"/>
               <w:left w:val="single" w:sz="4" w:space="0" w:color="auto"/>
@@ -1431,7 +1437,7 @@
         </w:tc>
         <w:tc>
           <w:tcPr>
-            <w:tcW w:w="810" w:type="dxa"/>
+            <w:tcW w:w="850" w:type="dxa"/>
             <w:vMerge/>
             <w:tcBorders>
               <w:top w:val="single" w:sz="4" w:space="0" w:color="auto"/>
@@ -1457,7 +1463,7 @@
         </w:tc>
         <w:tc>
           <w:tcPr>
-            <w:tcW w:w="2302" w:type="dxa"/>
+            <w:tcW w:w="2026" w:type="dxa"/>
             <w:vMerge/>
             <w:tcBorders>
               <w:top w:val="single" w:sz="4" w:space="0" w:color="auto"/>
@@ -1483,12 +1489,9 @@
         </w:tc>
       </w:tr>
       <w:tr>
-        <w:trPr>
-          <w:trHeight w:val="750"/>
-        </w:trPr>
-        <w:tc>
-          <w:tcPr>
-            <w:tcW w:w="668" w:type="dxa"/>
+        <w:tc>
+          <w:tcPr>
+            <w:tcW w:w="600" w:type="dxa"/>
             <w:tcBorders>
               <w:top w:val="single" w:sz="6" w:space="0" w:color="auto"/>
               <w:left w:val="single" w:sz="6" w:space="0" w:color="auto"/>
@@ -1507,8 +1510,8 @@
                 <w:rFonts w:ascii="Simplified Arabic" w:hAnsi="Simplified Arabic" w:cs="Simplified Arabic"/>
                 <w:b/>
                 <w:bCs/>
-                <w:sz w:val="20"/>
-                <w:szCs w:val="20"/>
+                <w:sz w:val="18"/>
+                <w:szCs w:val="18"/>
                 <w:rtl/>
               </w:rPr>
             </w:pPr>
@@ -1518,8 +1521,8 @@
                 <w:rFonts w:ascii="Simplified Arabic" w:hAnsi="Simplified Arabic" w:cs="Simplified Arabic" w:hint="cs"/>
                 <w:b/>
                 <w:bCs/>
-                <w:sz w:val="20"/>
-                <w:szCs w:val="20"/>
+                <w:sz w:val="18"/>
+                <w:szCs w:val="18"/>
                 <w:rtl/>
               </w:rPr>
               <w:t xml:space="preserve">${week_no}</w:t>
@@ -1528,7 +1531,7 @@
         </w:tc>
         <w:tc>
           <w:tcPr>
-            <w:tcW w:w="990" w:type="dxa"/>
+            <w:tcW w:w="750" w:type="dxa"/>
             <w:tcBorders>
               <w:top w:val="single" w:sz="6" w:space="0" w:color="auto"/>
               <w:left w:val="single" w:sz="6" w:space="0" w:color="auto"/>
@@ -1544,8 +1547,8 @@
                 <w:rFonts w:ascii="Simplified Arabic" w:hAnsi="Simplified Arabic" w:cs="Simplified Arabic"/>
                 <w:b/>
                 <w:bCs/>
-                <w:sz w:val="20"/>
-                <w:szCs w:val="20"/>
+                <w:sz w:val="18"/>
+                <w:szCs w:val="18"/>
                 <w:rtl/>
               </w:rPr>
             </w:pPr>
@@ -1554,8 +1557,8 @@
                 <w:rFonts w:ascii="Simplified Arabic" w:hAnsi="Simplified Arabic" w:cs="Simplified Arabic" w:hint="cs"/>
                 <w:b/>
                 <w:bCs/>
-                <w:sz w:val="20"/>
-                <w:szCs w:val="20"/>
+                <w:sz w:val="18"/>
+                <w:szCs w:val="18"/>
                 <w:rtl/>
               </w:rPr>
               <w:t xml:space="preserve">${week_dates}</w:t>
@@ -1564,7 +1567,7 @@
         </w:tc>
         <w:tc>
           <w:tcPr>
-            <w:tcW w:w="1710" w:type="dxa"/>
+            <w:tcW w:w="2600" w:type="dxa"/>
             <w:tcBorders>
               <w:top w:val="single" w:sz="6" w:space="0" w:color="auto"/>
               <w:left w:val="single" w:sz="6" w:space="0" w:color="auto"/>
@@ -1581,8 +1584,8 @@
                 <w:rFonts w:ascii="Simplified Arabic" w:hAnsi="Simplified Arabic" w:cs="Simplified Arabic"/>
                 <w:b/>
                 <w:bCs/>
-                <w:sz w:val="20"/>
-                <w:szCs w:val="20"/>
+                <w:sz w:val="18"/>
+                <w:szCs w:val="18"/>
               </w:rPr>
             </w:pPr>
             <w:r>
@@ -1609,8 +1612,8 @@
                 <w:rFonts w:ascii="Simplified Arabic" w:hAnsi="Simplified Arabic" w:cs="Simplified Arabic"/>
                 <w:b/>
                 <w:bCs/>
-                <w:sz w:val="20"/>
-                <w:szCs w:val="20"/>
+                <w:sz w:val="18"/>
+                <w:szCs w:val="18"/>
                 <w:rtl/>
               </w:rPr>
             </w:pPr>
@@ -1621,7 +1624,7 @@
         </w:tc>
         <w:tc>
           <w:tcPr>
-            <w:tcW w:w="720" w:type="dxa"/>
+            <w:tcW w:w="850" w:type="dxa"/>
             <w:tcBorders>
               <w:top w:val="single" w:sz="6" w:space="0" w:color="auto"/>
               <w:left w:val="single" w:sz="6" w:space="0" w:color="auto"/>
@@ -1638,8 +1641,8 @@
                 <w:rFonts w:ascii="Simplified Arabic" w:hAnsi="Simplified Arabic" w:cs="Simplified Arabic"/>
                 <w:b/>
                 <w:bCs/>
-                <w:sz w:val="20"/>
-                <w:szCs w:val="20"/>
+                <w:sz w:val="18"/>
+                <w:szCs w:val="18"/>
                 <w:rtl/>
               </w:rPr>
             </w:pPr>
@@ -1650,7 +1653,7 @@
         </w:tc>
         <w:tc>
           <w:tcPr>
-            <w:tcW w:w="630" w:type="dxa"/>
+            <w:tcW w:w="850" w:type="dxa"/>
             <w:tcBorders>
               <w:top w:val="single" w:sz="6" w:space="0" w:color="auto"/>
               <w:left w:val="single" w:sz="6" w:space="0" w:color="auto"/>
@@ -1667,8 +1670,8 @@
                 <w:rFonts w:ascii="Simplified Arabic" w:hAnsi="Simplified Arabic" w:cs="Simplified Arabic"/>
                 <w:b/>
                 <w:bCs/>
-                <w:sz w:val="20"/>
-                <w:szCs w:val="20"/>
+                <w:sz w:val="18"/>
+                <w:szCs w:val="18"/>
                 <w:rtl/>
               </w:rPr>
             </w:pPr>
@@ -1679,7 +1682,7 @@
         </w:tc>
         <w:tc>
           <w:tcPr>
-            <w:tcW w:w="810" w:type="dxa"/>
+            <w:tcW w:w="850" w:type="dxa"/>
             <w:tcBorders>
               <w:top w:val="single" w:sz="6" w:space="0" w:color="auto"/>
               <w:left w:val="single" w:sz="6" w:space="0" w:color="auto"/>
@@ -1696,8 +1699,8 @@
                 <w:rFonts w:ascii="Simplified Arabic" w:hAnsi="Simplified Arabic" w:cs="Simplified Arabic"/>
                 <w:b/>
                 <w:bCs/>
-                <w:sz w:val="20"/>
-                <w:szCs w:val="20"/>
+                <w:sz w:val="18"/>
+                <w:szCs w:val="18"/>
                 <w:rtl/>
               </w:rPr>
             </w:pPr>
@@ -1708,7 +1711,7 @@
         </w:tc>
         <w:tc>
           <w:tcPr>
-            <w:tcW w:w="810" w:type="dxa"/>
+            <w:tcW w:w="850" w:type="dxa"/>
             <w:tcBorders>
               <w:top w:val="single" w:sz="6" w:space="0" w:color="auto"/>
               <w:left w:val="single" w:sz="6" w:space="0" w:color="auto"/>
@@ -1725,8 +1728,8 @@
                 <w:rFonts w:ascii="Simplified Arabic" w:hAnsi="Simplified Arabic" w:cs="Simplified Arabic"/>
                 <w:b/>
                 <w:bCs/>
-                <w:sz w:val="20"/>
-                <w:szCs w:val="20"/>
+                <w:sz w:val="18"/>
+                <w:szCs w:val="18"/>
                 <w:rtl/>
               </w:rPr>
             </w:pPr>
@@ -1737,7 +1740,7 @@
         </w:tc>
         <w:tc>
           <w:tcPr>
-            <w:tcW w:w="2302" w:type="dxa"/>
+            <w:tcW w:w="2026" w:type="dxa"/>
             <w:tcBorders>
               <w:top w:val="single" w:sz="6" w:space="0" w:color="auto"/>
               <w:left w:val="single" w:sz="6" w:space="0" w:color="auto"/>
@@ -1754,8 +1757,8 @@
                 <w:rFonts w:ascii="Simplified Arabic" w:hAnsi="Simplified Arabic" w:cs="Simplified Arabic"/>
                 <w:b/>
                 <w:bCs/>
-                <w:sz w:val="20"/>
-                <w:szCs w:val="20"/>
+                <w:sz w:val="18"/>
+                <w:szCs w:val="18"/>
                 <w:rtl/>
                 <w:lang w:bidi="ar-KW"/>
               </w:rPr>
@@ -1765,8 +1768,8 @@
                 <w:rFonts w:ascii="Simplified Arabic" w:hAnsi="Simplified Arabic" w:cs="Simplified Arabic" w:hint="cs"/>
                 <w:b/>
                 <w:bCs/>
-                <w:sz w:val="20"/>
-                <w:szCs w:val="20"/>
+                <w:sz w:val="18"/>
+                <w:szCs w:val="18"/>
                 <w:rtl/>
                 <w:lang w:bidi="ar-KW"/>
               </w:rPr>
@@ -1781,7 +1784,7 @@
         </w:trPr>
         <w:tc>
           <w:tcPr>
-            <w:tcW w:w="3368" w:type="dxa"/>
+            <w:tcW w:w="3950" w:type="dxa"/>
             <w:gridSpan w:val="3"/>
             <w:tcBorders>
               <w:top w:val="single" w:sz="4" w:space="0" w:color="auto"/>
@@ -1800,18 +1803,18 @@
                 <w:rFonts w:ascii="Simplified Arabic" w:hAnsi="Simplified Arabic" w:cs="Simplified Arabic"/>
                 <w:b/>
                 <w:bCs/>
-                <w:sz w:val="20"/>
-                <w:szCs w:val="20"/>
-                <w:rtl/>
-              </w:rPr>
-            </w:pPr>
-            <w:r>
-              <w:rPr>
-                <w:rFonts w:ascii="Simplified Arabic" w:hAnsi="Simplified Arabic" w:cs="Simplified Arabic"/>
-                <w:b/>
-                <w:bCs/>
-                <w:sz w:val="20"/>
-                <w:szCs w:val="20"/>
+                <w:sz w:val="18"/>
+                <w:szCs w:val="18"/>
+                <w:rtl/>
+              </w:rPr>
+            </w:pPr>
+            <w:r>
+              <w:rPr>
+                <w:rFonts w:ascii="Simplified Arabic" w:hAnsi="Simplified Arabic" w:cs="Simplified Arabic"/>
+                <w:b/>
+                <w:bCs/>
+                <w:sz w:val="18"/>
+                <w:szCs w:val="18"/>
                 <w:rtl/>
               </w:rPr>
               <w:t>المجموع</w:t>
@@ -1838,8 +1841,8 @@
                 <w:rFonts w:ascii="Simplified Arabic" w:hAnsi="Simplified Arabic" w:cs="Simplified Arabic"/>
                 <w:b/>
                 <w:bCs/>
-                <w:sz w:val="20"/>
-                <w:szCs w:val="20"/>
+                <w:sz w:val="18"/>
+                <w:szCs w:val="18"/>
                 <w:rtl/>
               </w:rPr>
             </w:pPr>
@@ -1850,7 +1853,7 @@
         </w:tc>
         <w:tc>
           <w:tcPr>
-            <w:tcW w:w="720" w:type="dxa"/>
+            <w:tcW w:w="850" w:type="dxa"/>
             <w:tcBorders>
               <w:top w:val="single" w:sz="4" w:space="0" w:color="auto"/>
               <w:left w:val="single" w:sz="4" w:space="0" w:color="auto"/>
@@ -1868,8 +1871,8 @@
                 <w:rFonts w:ascii="Simplified Arabic" w:hAnsi="Simplified Arabic" w:cs="Simplified Arabic"/>
                 <w:b/>
                 <w:bCs/>
-                <w:sz w:val="20"/>
-                <w:szCs w:val="20"/>
+                <w:sz w:val="18"/>
+                <w:szCs w:val="18"/>
                 <w:rtl/>
               </w:rPr>
             </w:pPr>
@@ -1880,7 +1883,7 @@
         </w:tc>
         <w:tc>
           <w:tcPr>
-            <w:tcW w:w="630" w:type="dxa"/>
+            <w:tcW w:w="850" w:type="dxa"/>
             <w:tcBorders>
               <w:top w:val="single" w:sz="4" w:space="0" w:color="auto"/>
               <w:left w:val="single" w:sz="4" w:space="0" w:color="auto"/>
@@ -1898,8 +1901,8 @@
                 <w:rFonts w:ascii="Simplified Arabic" w:hAnsi="Simplified Arabic" w:cs="Simplified Arabic"/>
                 <w:b/>
                 <w:bCs/>
-                <w:sz w:val="20"/>
-                <w:szCs w:val="20"/>
+                <w:sz w:val="18"/>
+                <w:szCs w:val="18"/>
                 <w:rtl/>
               </w:rPr>
             </w:pPr>
@@ -1910,7 +1913,7 @@
         </w:tc>
         <w:tc>
           <w:tcPr>
-            <w:tcW w:w="810" w:type="dxa"/>
+            <w:tcW w:w="850" w:type="dxa"/>
             <w:tcBorders>
               <w:top w:val="single" w:sz="4" w:space="0" w:color="auto"/>
               <w:left w:val="single" w:sz="4" w:space="0" w:color="auto"/>
@@ -1928,8 +1931,8 @@
                 <w:rFonts w:ascii="Simplified Arabic" w:hAnsi="Simplified Arabic" w:cs="Simplified Arabic"/>
                 <w:b/>
                 <w:bCs/>
-                <w:sz w:val="20"/>
-                <w:szCs w:val="20"/>
+                <w:sz w:val="18"/>
+                <w:szCs w:val="18"/>
                 <w:rtl/>
               </w:rPr>
             </w:pPr>
@@ -1940,7 +1943,7 @@
         </w:tc>
         <w:tc>
           <w:tcPr>
-            <w:tcW w:w="810" w:type="dxa"/>
+            <w:tcW w:w="850" w:type="dxa"/>
             <w:tcBorders>
               <w:top w:val="single" w:sz="4" w:space="0" w:color="auto"/>
               <w:left w:val="single" w:sz="4" w:space="0" w:color="auto"/>
@@ -1958,8 +1961,8 @@
                 <w:rFonts w:ascii="Simplified Arabic" w:hAnsi="Simplified Arabic" w:cs="Simplified Arabic"/>
                 <w:b/>
                 <w:bCs/>
-                <w:sz w:val="20"/>
-                <w:szCs w:val="20"/>
+                <w:sz w:val="18"/>
+                <w:szCs w:val="18"/>
                 <w:rtl/>
               </w:rPr>
             </w:pPr>
@@ -1970,7 +1973,7 @@
         </w:tc>
         <w:tc>
           <w:tcPr>
-            <w:tcW w:w="2302" w:type="dxa"/>
+            <w:tcW w:w="2026" w:type="dxa"/>
             <w:tcBorders>
               <w:top w:val="single" w:sz="4" w:space="0" w:color="auto"/>
               <w:left w:val="single" w:sz="4" w:space="0" w:color="auto"/>
@@ -1988,8 +1991,8 @@
                 <w:rFonts w:ascii="Simplified Arabic" w:hAnsi="Simplified Arabic" w:cs="Simplified Arabic"/>
                 <w:b/>
                 <w:bCs/>
-                <w:sz w:val="20"/>
-                <w:szCs w:val="20"/>
+                <w:sz w:val="18"/>
+                <w:szCs w:val="18"/>
                 <w:rtl/>
               </w:rPr>
             </w:pPr>
@@ -2165,153 +2168,14 @@
         <w:rtl/>
         <w:lang w:bidi="ar-KW"/>
       </w:rPr>
-      <w:t>توقيع عضو هيئة التدريس المنتد</w:t>
-    </w:r>
-    <w:r>
-      <w:rPr>
-        <w:rFonts w:cs="PT Bold Heading" w:hint="cs"/>
-        <w:b/>
-        <w:bCs/>
-        <w:rtl/>
-        <w:lang w:bidi="ar-KW"/>
-      </w:rPr>
+      <w:t xml:space="preserve">توقيع عضو هيئة التدريس المنتدب</w:t>
       <w:tab/>
-      <w:t>ب</w:t>
-    </w:r>
-    <w:r>
-      <w:rPr>
-        <w:rFonts w:cs="PT Bold Heading"/>
-        <w:b/>
-        <w:bCs/>
-        <w:lang w:bidi="ar-KW"/>
-      </w:rPr>
-      <w:t xml:space="preserve"> </w:t>
-    </w:r>
-    <w:r>
-      <w:rPr>
-        <w:rFonts w:cs="PT Bold Heading" w:hint="cs"/>
-        <w:b/>
-        <w:bCs/>
-        <w:rtl/>
-        <w:lang w:bidi="ar-KW"/>
-      </w:rPr>
-      <w:t xml:space="preserve">  </w:t>
-    </w:r>
-    <w:r>
-      <w:rPr>
-        <w:rFonts w:cs="PT Bold Heading"/>
-        <w:b/>
-        <w:bCs/>
-        <w:lang w:bidi="ar-KW"/>
-      </w:rPr>
-      <w:t xml:space="preserve"> </w:t>
-    </w:r>
-    <w:r>
-      <w:rPr>
-        <w:rFonts w:cs="PT Bold Heading" w:hint="cs"/>
-        <w:b/>
-        <w:bCs/>
-        <w:rtl/>
-        <w:lang w:bidi="ar-KW"/>
-      </w:rPr>
+      <w:t xml:space="preserve">    </w:t>
       <w:tab/>
-    </w:r>
-    <w:r>
-      <w:rPr>
-        <w:rFonts w:cs="PT Bold Heading"/>
-        <w:b/>
-        <w:bCs/>
-        <w:lang w:bidi="ar-KW"/>
-      </w:rPr>
-      <w:t xml:space="preserve"> </w:t>
-    </w:r>
-    <w:r>
-      <w:rPr>
-        <w:rFonts w:cs="PT Bold Heading" w:hint="cs"/>
-        <w:b/>
-        <w:bCs/>
-        <w:rtl/>
-        <w:lang w:bidi="ar-KW"/>
-      </w:rPr>
-      <w:t xml:space="preserve"> </w:t>
-    </w:r>
-    <w:r>
-      <w:rPr>
-        <w:rFonts w:cs="PT Bold Heading"/>
-        <w:b/>
-        <w:bCs/>
-        <w:lang w:bidi="ar-KW"/>
-      </w:rPr>
-      <w:t xml:space="preserve">       </w:t>
-    </w:r>
-    <w:r>
-      <w:rPr>
-        <w:rFonts w:cs="PT Bold Heading" w:hint="cs"/>
-        <w:b/>
-        <w:bCs/>
-        <w:rtl/>
-        <w:lang w:bidi="ar-KW"/>
-      </w:rPr>
-      <w:t xml:space="preserve">  </w:t>
-    </w:r>
-    <w:r>
-      <w:rPr>
-        <w:rFonts w:cs="PT Bold Heading"/>
-        <w:b/>
-        <w:bCs/>
-        <w:lang w:bidi="ar-KW"/>
-      </w:rPr>
-      <w:t xml:space="preserve">  </w:t>
-    </w:r>
-    <w:r>
-      <w:rPr>
-        <w:rFonts w:cs="PT Bold Heading" w:hint="cs"/>
-        <w:b/>
-        <w:bCs/>
-        <w:rtl/>
-        <w:lang w:bidi="ar-KW"/>
-      </w:rPr>
-      <w:t>رئيس القسم</w:t>
-    </w:r>
-    <w:r>
-      <w:rPr>
-        <w:rFonts w:cs="PT Bold Heading" w:hint="cs"/>
-        <w:b/>
-        <w:bCs/>
-        <w:rtl/>
-        <w:lang w:bidi="ar-KW"/>
-      </w:rPr>
+      <w:t xml:space="preserve">             رئيس القسم</w:t>
       <w:tab/>
-    </w:r>
-    <w:r>
-      <w:rPr>
-        <w:rFonts w:cs="PT Bold Heading" w:hint="cs"/>
-        <w:b/>
-        <w:bCs/>
-        <w:rtl/>
-        <w:lang w:bidi="ar-KW"/>
-      </w:rPr>
       <w:tab/>
-      <w:t xml:space="preserve">        </w:t>
-    </w:r>
-    <w:r>
-      <w:rPr>
-        <w:rFonts w:cs="PT Bold Heading"/>
-        <w:b/>
-        <w:bCs/>
-        <w:lang w:bidi="ar-KW"/>
-      </w:rPr>
-      <w:t xml:space="preserve"> </w:t>
-    </w:r>
-    <w:r>
-      <w:rPr>
-        <w:rFonts w:cs="PT Bold Heading" w:hint="cs"/>
-        <w:b/>
-        <w:bCs/>
-        <w:rtl/>
-        <w:lang w:bidi="ar-KW"/>
-      </w:rPr>
-      <w:t>يعتمد/ عميد الكلية</w:t>
+      <w:t xml:space="preserve">         يعتمد/ عميد الكلية</w:t>
     </w:r>
   </w:p>
   <w:p>

</xml_diff>

<commit_message>
fix(attestations): drop blank lines before the (خ-3) note so five-week months fit one page
Three empty paragraphs between the schedule table and the "ملاحظة مهمة"
note pushed the note onto a lone second page for a five-week month with
two course lines per row. build-kh3-template.py now strips those blank
paragraphs and adds a 120-twip spacing-before on the note paragraph
instead, then rebuilds kh3-template.docx (50 placeholders, unchanged).

Co-Authored-By: Claude Fable 5.1 <noreply@anthropic.com>
</commit_message>
<xml_diff>
--- a/resources/forms/kh3-template.docx
+++ b/resources/forms/kh3-template.docx
@@ -2006,38 +2006,7 @@
     <w:p>
       <w:pPr>
         <w:bidi/>
-        <w:rPr>
-          <w:b/>
-          <w:bCs/>
-          <w:sz w:val="20"/>
-          <w:szCs w:val="20"/>
-          <w:rtl/>
-        </w:rPr>
-      </w:pPr>
-    </w:p>
-    <w:p>
-      <w:pPr>
-        <w:bidi/>
-        <w:rPr>
-          <w:sz w:val="15"/>
-          <w:szCs w:val="15"/>
-          <w:rtl/>
-        </w:rPr>
-      </w:pPr>
-    </w:p>
-    <w:p>
-      <w:pPr>
-        <w:bidi/>
-        <w:rPr>
-          <w:sz w:val="14"/>
-          <w:szCs w:val="14"/>
-          <w:rtl/>
-        </w:rPr>
-      </w:pPr>
-    </w:p>
-    <w:p>
-      <w:pPr>
-        <w:bidi/>
+        <w:spacing w:before="120"/>
         <w:rPr>
           <w:b/>
           <w:bCs/>

</xml_diff>

<commit_message>
fix(attestations): fold the (خ-3) page break into the note run; trim title-line margin
A full page one (five weeks, two course lines) left no room for the standalone
page-break paragraph before ${/page}, spilling a blank page two. The break is
now the note paragraph's own last run instead of a paragraph of its own, and
Kh3TemplateProcessor::stripLastPageBreak() strips that run (not a paragraph).
Also drop the two empty paragraphs around the schedule-title lines between the
phones field and the table, giving the first title line a 160-twip
spacing-before to recover some of the margin they used to provide.

Co-Authored-By: Claude Fable 5.1 <noreply@anthropic.com>
</commit_message>
<xml_diff>
--- a/resources/forms/kh3-template.docx
+++ b/resources/forms/kh3-template.docx
@@ -789,20 +789,7 @@
     </w:p>
     <w:p>
       <w:pPr>
-        <w:spacing w:line="360" w:lineRule="auto"/>
-        <w:jc w:val="right"/>
-        <w:rPr>
-          <w:b/>
-          <w:bCs/>
-          <w:sz w:val="14"/>
-          <w:szCs w:val="14"/>
-          <w:rtl/>
-        </w:rPr>
-      </w:pPr>
-    </w:p>
-    <w:p>
-      <w:pPr>
-        <w:spacing w:line="360" w:lineRule="auto"/>
+        <w:spacing w:before="160" w:line="360" w:lineRule="auto"/>
         <w:jc w:val="center"/>
         <w:rPr>
           <w:sz w:val="20"/>
@@ -883,35 +870,6 @@
         <w:t>)</w:t>
       </w:r>
     </w:p>
-    <w:p>
-      <w:pPr>
-        <w:tabs>
-          <w:tab w:val="left" w:pos="2630"/>
-          <w:tab w:val="center" w:pos="4680"/>
-          <w:tab w:val="left" w:pos="6720"/>
-        </w:tabs>
-        <w:spacing w:line="360" w:lineRule="auto"/>
-        <w:rPr>
-          <w:rFonts w:cs="PT Bold Heading"/>
-          <w:b/>
-          <w:bCs/>
-          <w:sz w:val="20"/>
-          <w:szCs w:val="20"/>
-          <w:rtl/>
-        </w:rPr>
-      </w:pPr>
-      <w:r>
-        <w:rPr>
-          <w:rFonts w:cs="PT Bold Heading"/>
-          <w:b/>
-          <w:bCs/>
-          <w:sz w:val="18"/>
-          <w:szCs w:val="18"/>
-          <w:rtl/>
-        </w:rPr>
-        <w:tab/>
-      </w:r>
-    </w:p>
     <w:tbl>
       <w:tblPr>
         <w:tblStyle w:val="TableGrid"/>
@@ -2073,8 +2031,6 @@
         </w:rPr>
         <w:t>لاحقا خلال الفصل الدراسي أو أي تغيير في العطل الرسمية.</w:t>
       </w:r>
-    </w:p>
-    <w:p>
       <w:r>
         <w:br w:type="page"/>
       </w:r>

</xml_diff>